<commit_message>
Guide utilisateur : connexion par code et gestion des utilisateurs
Co-Authored-By: Claude Opus 5.5 <noreply@anthropic.com>
Claude-Session: https://claude.ai/code/session_012Q4Ft5thuS6fzborG83ivS
</commit_message>
<xml_diff>
--- a/docs/Guide_Suivi_des_mailles.docx
+++ b/docs/Guide_Suivi_des_mailles.docx
@@ -30,7 +30,7 @@
           <w:sz w:val="24"/>
           <w:szCs w:val="24"/>
         </w:rPr>
-        <w:t xml:space="preserve">Guide utilisateur – version 1.1 – octobre 2026</w:t>
+        <w:t xml:space="preserve">Guide utilisateur – version 1.2 – octobre 2026</w:t>
       </w:r>
     </w:p>
     <w:p>
@@ -60,7 +60,7 @@
         <w:t xml:space="preserve">http://localhost:8082/</w:t>
       </w:r>
       <w:r>
-        <w:t xml:space="preserve"> sur le serveur. Chaque modification est enregistrée immédiatement : il n'y a pas de bouton « Enregistrer ».</w:t>
+        <w:t xml:space="preserve"> sur le serveur, après connexion par un code reçu par mail. Chaque modification est enregistrée immédiatement : il n'y a pas de bouton « Enregistrer ».</w:t>
       </w:r>
     </w:p>
     <w:tbl>
@@ -353,7 +353,426 @@
         <w:pStyle w:val="Heading1"/>
       </w:pPr>
       <w:r>
-        <w:t xml:space="preserve">1. Gestion des sociétés</w:t>
+        <w:t xml:space="preserve">1. Connexion</w:t>
+      </w:r>
+    </w:p>
+    <w:p>
+      <w:pPr>
+        <w:spacing w:after="120" w:line="288"/>
+      </w:pPr>
+      <w:r>
+        <w:t xml:space="preserve">L'accès est réservé aux adresses mail déclarées par un administrateur. La connexion se fait en deux temps, sans mot de passe :</w:t>
+      </w:r>
+    </w:p>
+    <w:p>
+      <w:pPr>
+        <w:pStyle w:val="ListParagraph"/>
+        <w:numPr>
+          <w:ilvl w:val="0"/>
+          <w:numId w:val="2"/>
+        </w:numPr>
+        <w:spacing w:after="80" w:line="276"/>
+      </w:pPr>
+      <w:r>
+        <w:t xml:space="preserve">Saisissez votre </w:t>
+      </w:r>
+      <w:r>
+        <w:rPr>
+          <w:b/>
+          <w:bCs/>
+        </w:rPr>
+        <w:t xml:space="preserve">adresse mail</w:t>
+      </w:r>
+      <w:r>
+        <w:t xml:space="preserve"> et cliquez sur </w:t>
+      </w:r>
+      <w:r>
+        <w:rPr>
+          <w:b/>
+          <w:bCs/>
+        </w:rPr>
+        <w:t xml:space="preserve">Recevoir un code</w:t>
+      </w:r>
+      <w:r>
+        <w:t xml:space="preserve">. Si l'adresse n'est pas déclarée, un message vous invite à contacter un administrateur.</w:t>
+      </w:r>
+    </w:p>
+    <w:p>
+      <w:pPr>
+        <w:pStyle w:val="ListParagraph"/>
+        <w:numPr>
+          <w:ilvl w:val="0"/>
+          <w:numId w:val="2"/>
+        </w:numPr>
+        <w:spacing w:after="80" w:line="276"/>
+      </w:pPr>
+      <w:r>
+        <w:t xml:space="preserve">Ouvrez le mail « Votre code d'accès - Suivi des mailles », saisissez le </w:t>
+      </w:r>
+      <w:r>
+        <w:rPr>
+          <w:b/>
+          <w:bCs/>
+        </w:rPr>
+        <w:t xml:space="preserve">code de 10 caractères</w:t>
+      </w:r>
+      <w:r>
+        <w:t xml:space="preserve"> (respectez majuscules et minuscules ; le copier-coller fonctionne) et cliquez sur </w:t>
+      </w:r>
+      <w:r>
+        <w:rPr>
+          <w:b/>
+          <w:bCs/>
+        </w:rPr>
+        <w:t xml:space="preserve">Se connecter</w:t>
+      </w:r>
+      <w:r>
+        <w:t xml:space="preserve">.</w:t>
+      </w:r>
+    </w:p>
+    <w:tbl>
+      <w:tblPr>
+        <w:tblW w:type="dxa" w:w="9638"/>
+        <w:tblBorders>
+          <w:top w:val="single" w:color="auto" w:sz="4"/>
+          <w:left w:val="single" w:color="auto" w:sz="4"/>
+          <w:bottom w:val="single" w:color="auto" w:sz="4"/>
+          <w:right w:val="single" w:color="auto" w:sz="4"/>
+          <w:insideH w:val="single" w:color="auto" w:sz="4"/>
+          <w:insideV w:val="single" w:color="auto" w:sz="4"/>
+        </w:tblBorders>
+      </w:tblPr>
+      <w:tblGrid>
+        <w:gridCol w:w="4819"/>
+        <w:gridCol w:w="4819"/>
+      </w:tblGrid>
+      <w:tr>
+        <w:tc>
+          <w:tcPr>
+            <w:tcW w:type="dxa" w:w="4819"/>
+            <w:tcBorders>
+              <w:top w:val="single" w:color="FFFFFF" w:sz="4"/>
+              <w:left w:val="single" w:color="FFFFFF" w:sz="4"/>
+              <w:bottom w:val="single" w:color="FFFFFF" w:sz="4"/>
+              <w:right w:val="single" w:color="FFFFFF" w:sz="4"/>
+            </w:tcBorders>
+          </w:tcPr>
+          <w:p>
+            <w:pPr>
+              <w:keepNext/>
+              <w:spacing w:after="60" w:before="120"/>
+              <w:jc w:val="center"/>
+            </w:pPr>
+            <w:r>
+              <w:drawing>
+                <wp:inline distT="0" distB="0" distL="0" distR="0">
+                  <wp:extent cx="2476500" cy="1552575"/>
+                  <wp:effectExtent t="0" r="0" b="0" l="0"/>
+                  <wp:docPr id="1" name="cnx-email.png" descr="Saisie de l'adresse mail" title="Saisie de l'adresse mail"/>
+                  <wp:cNvGraphicFramePr>
+                    <a:graphicFrameLocks xmlns:a="http://schemas.openxmlformats.org/drawingml/2006/main" noChangeAspect="1"/>
+                  </wp:cNvGraphicFramePr>
+                  <a:graphic xmlns:a="http://schemas.openxmlformats.org/drawingml/2006/main">
+                    <a:graphicData uri="http://schemas.openxmlformats.org/drawingml/2006/picture">
+                      <pic:pic xmlns:pic="http://schemas.openxmlformats.org/drawingml/2006/picture">
+                        <pic:nvPicPr>
+                          <pic:cNvPr id="0" name="" descr=""/>
+                          <pic:cNvPicPr>
+                            <a:picLocks noChangeAspect="1" noChangeArrowheads="1"/>
+                          </pic:cNvPicPr>
+                        </pic:nvPicPr>
+                        <pic:blipFill>
+                          <a:blip r:embed="rId9" cstate="none"/>
+                          <a:srcRect/>
+                          <a:stretch>
+                            <a:fillRect/>
+                          </a:stretch>
+                        </pic:blipFill>
+                        <pic:spPr bwMode="auto">
+                          <a:xfrm>
+                            <a:off x="0" y="0"/>
+                            <a:ext cx="2476500" cy="1552575"/>
+                          </a:xfrm>
+                          <a:prstGeom prst="rect">
+                            <a:avLst/>
+                          </a:prstGeom>
+                        </pic:spPr>
+                      </pic:pic>
+                    </a:graphicData>
+                  </a:graphic>
+                </wp:inline>
+              </w:drawing>
+            </w:r>
+          </w:p>
+          <w:p>
+            <w:pPr>
+              <w:spacing w:after="200"/>
+              <w:jc w:val="center"/>
+            </w:pPr>
+            <w:r>
+              <w:rPr>
+                <w:b/>
+                <w:bCs/>
+                <w:color w:val="5D6779"/>
+                <w:sz w:val="18"/>
+                <w:szCs w:val="18"/>
+              </w:rPr>
+              <w:t xml:space="preserve">Figure 1 – </w:t>
+            </w:r>
+            <w:r>
+              <w:rPr>
+                <w:i/>
+                <w:iCs/>
+                <w:color w:val="5D6779"/>
+                <w:sz w:val="18"/>
+                <w:szCs w:val="18"/>
+              </w:rPr>
+              <w:t xml:space="preserve">Saisie de l'adresse mail</w:t>
+            </w:r>
+          </w:p>
+        </w:tc>
+        <w:tc>
+          <w:tcPr>
+            <w:tcW w:type="dxa" w:w="4819"/>
+            <w:tcBorders>
+              <w:top w:val="single" w:color="FFFFFF" w:sz="4"/>
+              <w:left w:val="single" w:color="FFFFFF" w:sz="4"/>
+              <w:bottom w:val="single" w:color="FFFFFF" w:sz="4"/>
+              <w:right w:val="single" w:color="FFFFFF" w:sz="4"/>
+            </w:tcBorders>
+          </w:tcPr>
+          <w:p>
+            <w:pPr>
+              <w:keepNext/>
+              <w:spacing w:after="60" w:before="120"/>
+              <w:jc w:val="center"/>
+            </w:pPr>
+            <w:r>
+              <w:drawing>
+                <wp:inline distT="0" distB="0" distL="0" distR="0">
+                  <wp:extent cx="2476500" cy="1981200"/>
+                  <wp:effectExtent t="0" r="0" b="0" l="0"/>
+                  <wp:docPr id="1" name="cnx-code.png" descr="Saisie du code reçu" title="Saisie du code reçu"/>
+                  <wp:cNvGraphicFramePr>
+                    <a:graphicFrameLocks xmlns:a="http://schemas.openxmlformats.org/drawingml/2006/main" noChangeAspect="1"/>
+                  </wp:cNvGraphicFramePr>
+                  <a:graphic xmlns:a="http://schemas.openxmlformats.org/drawingml/2006/main">
+                    <a:graphicData uri="http://schemas.openxmlformats.org/drawingml/2006/picture">
+                      <pic:pic xmlns:pic="http://schemas.openxmlformats.org/drawingml/2006/picture">
+                        <pic:nvPicPr>
+                          <pic:cNvPr id="0" name="" descr=""/>
+                          <pic:cNvPicPr>
+                            <a:picLocks noChangeAspect="1" noChangeArrowheads="1"/>
+                          </pic:cNvPicPr>
+                        </pic:nvPicPr>
+                        <pic:blipFill>
+                          <a:blip r:embed="rId10" cstate="none"/>
+                          <a:srcRect/>
+                          <a:stretch>
+                            <a:fillRect/>
+                          </a:stretch>
+                        </pic:blipFill>
+                        <pic:spPr bwMode="auto">
+                          <a:xfrm>
+                            <a:off x="0" y="0"/>
+                            <a:ext cx="2476500" cy="1981200"/>
+                          </a:xfrm>
+                          <a:prstGeom prst="rect">
+                            <a:avLst/>
+                          </a:prstGeom>
+                        </pic:spPr>
+                      </pic:pic>
+                    </a:graphicData>
+                  </a:graphic>
+                </wp:inline>
+              </w:drawing>
+            </w:r>
+          </w:p>
+          <w:p>
+            <w:pPr>
+              <w:spacing w:after="200"/>
+              <w:jc w:val="center"/>
+            </w:pPr>
+            <w:r>
+              <w:rPr>
+                <w:b/>
+                <w:bCs/>
+                <w:color w:val="5D6779"/>
+                <w:sz w:val="18"/>
+                <w:szCs w:val="18"/>
+              </w:rPr>
+              <w:t xml:space="preserve">Figure 2 – </w:t>
+            </w:r>
+            <w:r>
+              <w:rPr>
+                <w:i/>
+                <w:iCs/>
+                <w:color w:val="5D6779"/>
+                <w:sz w:val="18"/>
+                <w:szCs w:val="18"/>
+              </w:rPr>
+              <w:t xml:space="preserve">Saisie du code reçu</w:t>
+            </w:r>
+          </w:p>
+        </w:tc>
+      </w:tr>
+    </w:tbl>
+    <w:p>
+      <w:pPr>
+        <w:pStyle w:val="ListParagraph"/>
+        <w:numPr>
+          <w:ilvl w:val="0"/>
+          <w:numId w:val="3"/>
+        </w:numPr>
+        <w:spacing w:after="60" w:line="276"/>
+      </w:pPr>
+      <w:r>
+        <w:t xml:space="preserve">Le code est valable </w:t>
+      </w:r>
+      <w:r>
+        <w:rPr>
+          <w:b/>
+          <w:bCs/>
+        </w:rPr>
+        <w:t xml:space="preserve">jusqu'à 23 h 59 le jour même</w:t>
+      </w:r>
+      <w:r>
+        <w:t xml:space="preserve"> : il peut être réutilisé dans la journée. La session se ferme aussi à minuit.</w:t>
+      </w:r>
+    </w:p>
+    <w:p>
+      <w:pPr>
+        <w:pStyle w:val="ListParagraph"/>
+        <w:numPr>
+          <w:ilvl w:val="0"/>
+          <w:numId w:val="3"/>
+        </w:numPr>
+        <w:spacing w:after="60" w:line="276"/>
+      </w:pPr>
+      <w:r>
+        <w:t xml:space="preserve">Après </w:t>
+      </w:r>
+      <w:r>
+        <w:rPr>
+          <w:b/>
+          <w:bCs/>
+        </w:rPr>
+        <w:t xml:space="preserve">5 codes erronés</w:t>
+      </w:r>
+      <w:r>
+        <w:t xml:space="preserve">, il faut demander un nouveau code (lien </w:t>
+      </w:r>
+      <w:r>
+        <w:rPr>
+          <w:b/>
+          <w:bCs/>
+        </w:rPr>
+        <w:t xml:space="preserve">Recevoir un nouveau code</w:t>
+      </w:r>
+      <w:r>
+        <w:t xml:space="preserve">, au plus un par minute). Un nouveau code remplace le précédent.</w:t>
+      </w:r>
+    </w:p>
+    <w:p>
+      <w:pPr>
+        <w:pStyle w:val="ListParagraph"/>
+        <w:numPr>
+          <w:ilvl w:val="0"/>
+          <w:numId w:val="3"/>
+        </w:numPr>
+        <w:spacing w:after="60" w:line="276"/>
+      </w:pPr>
+      <w:r>
+        <w:t xml:space="preserve">En haut de l'écran figurent votre nom, votre </w:t>
+      </w:r>
+      <w:r>
+        <w:rPr>
+          <w:b/>
+          <w:bCs/>
+        </w:rPr>
+        <w:t xml:space="preserve">profil</w:t>
+      </w:r>
+      <w:r>
+        <w:t xml:space="preserve"> (Admin ou User) et le bouton </w:t>
+      </w:r>
+      <w:r>
+        <w:rPr>
+          <w:b/>
+          <w:bCs/>
+        </w:rPr>
+        <w:t xml:space="preserve">Se déconnecter</w:t>
+      </w:r>
+      <w:r>
+        <w:t xml:space="preserve">.</w:t>
+      </w:r>
+    </w:p>
+    <w:tbl>
+      <w:tblPr>
+        <w:tblW w:type="dxa" w:w="9638"/>
+        <w:tblBorders>
+          <w:top w:val="single" w:color="auto" w:sz="4"/>
+          <w:left w:val="single" w:color="auto" w:sz="4"/>
+          <w:bottom w:val="single" w:color="auto" w:sz="4"/>
+          <w:right w:val="single" w:color="auto" w:sz="4"/>
+          <w:insideH w:val="single" w:color="auto" w:sz="4"/>
+          <w:insideV w:val="single" w:color="auto" w:sz="4"/>
+        </w:tblBorders>
+      </w:tblPr>
+      <w:tblGrid>
+        <w:gridCol w:w="9638"/>
+      </w:tblGrid>
+      <w:tr>
+        <w:trPr>
+          <w:cantSplit/>
+        </w:trPr>
+        <w:tc>
+          <w:tcPr>
+            <w:tcW w:type="dxa" w:w="9638"/>
+            <w:tcBorders>
+              <w:top w:val="single" w:color="E8EEF8" w:sz="4"/>
+              <w:left w:val="single" w:color="1F5FD1" w:sz="24"/>
+              <w:bottom w:val="single" w:color="E8EEF8" w:sz="4"/>
+              <w:right w:val="single" w:color="E8EEF8" w:sz="4"/>
+            </w:tcBorders>
+            <w:shd w:fill="E8EEF8" w:color="auto" w:val="clear"/>
+            <w:tcMar>
+              <w:top w:type="dxa" w:w="120"/>
+              <w:left w:type="dxa" w:w="200"/>
+              <w:bottom w:type="dxa" w:w="120"/>
+              <w:right w:type="dxa" w:w="200"/>
+            </w:tcMar>
+          </w:tcPr>
+          <w:p>
+            <w:pPr>
+              <w:spacing w:after="60"/>
+            </w:pPr>
+            <w:r>
+              <w:rPr>
+                <w:b/>
+                <w:bCs/>
+                <w:color w:val="1F5FD1"/>
+              </w:rPr>
+              <w:t xml:space="preserve">Mail non reçu</w:t>
+            </w:r>
+          </w:p>
+          <w:p>
+            <w:pPr>
+              <w:spacing w:after="60" w:line="276"/>
+            </w:pPr>
+            <w:r>
+              <w:t xml:space="preserve">Vérifiez le dossier des courriers indésirables, puis contactez un administrateur : l'onglet Utilisateurs permet de tester l'envoi des mails.</w:t>
+            </w:r>
+          </w:p>
+        </w:tc>
+      </w:tr>
+    </w:tbl>
+    <w:p>
+      <w:pPr>
+        <w:pStyle w:val="Heading1"/>
+        <w:pageBreakBefore/>
+      </w:pPr>
+      <w:r>
+        <w:t xml:space="preserve">2. Gestion des sociétés</w:t>
       </w:r>
     </w:p>
     <w:p>
@@ -409,7 +828,7 @@
                     </pic:cNvPicPr>
                   </pic:nvPicPr>
                   <pic:blipFill>
-                    <a:blip r:embed="rId9" cstate="none"/>
+                    <a:blip r:embed="rId11" cstate="none"/>
                     <a:srcRect/>
                     <a:stretch>
                       <a:fillRect/>
@@ -444,7 +863,7 @@
           <w:sz w:val="18"/>
           <w:szCs w:val="18"/>
         </w:rPr>
-        <w:t xml:space="preserve">Figure 1 – </w:t>
+        <w:t xml:space="preserve">Figure 3 – </w:t>
       </w:r>
       <w:r>
         <w:rPr>
@@ -470,7 +889,7 @@
         <w:pStyle w:val="ListParagraph"/>
         <w:numPr>
           <w:ilvl w:val="0"/>
-          <w:numId w:val="2"/>
+          <w:numId w:val="4"/>
         </w:numPr>
         <w:spacing w:after="80" w:line="276"/>
       </w:pPr>
@@ -503,7 +922,7 @@
         <w:pStyle w:val="ListParagraph"/>
         <w:numPr>
           <w:ilvl w:val="0"/>
-          <w:numId w:val="2"/>
+          <w:numId w:val="4"/>
         </w:numPr>
         <w:spacing w:after="80" w:line="276"/>
       </w:pPr>
@@ -542,7 +961,7 @@
         <w:pStyle w:val="ListParagraph"/>
         <w:numPr>
           <w:ilvl w:val="0"/>
-          <w:numId w:val="3"/>
+          <w:numId w:val="5"/>
         </w:numPr>
         <w:spacing w:after="80" w:line="276"/>
       </w:pPr>
@@ -565,7 +984,7 @@
         <w:pStyle w:val="ListParagraph"/>
         <w:numPr>
           <w:ilvl w:val="0"/>
-          <w:numId w:val="3"/>
+          <w:numId w:val="5"/>
         </w:numPr>
         <w:spacing w:after="80" w:line="276"/>
       </w:pPr>
@@ -617,7 +1036,7 @@
         <w:pageBreakBefore/>
       </w:pPr>
       <w:r>
-        <w:t xml:space="preserve">2. Chaîne de mise à jour des mailles</w:t>
+        <w:t xml:space="preserve">3. Chaîne de mise à jour des mailles</w:t>
       </w:r>
     </w:p>
     <w:p>
@@ -1167,7 +1586,7 @@
         <w:pStyle w:val="ListParagraph"/>
         <w:numPr>
           <w:ilvl w:val="0"/>
-          <w:numId w:val="4"/>
+          <w:numId w:val="6"/>
         </w:numPr>
         <w:spacing w:after="80" w:line="276"/>
       </w:pPr>
@@ -1202,7 +1621,7 @@
         <w:pStyle w:val="ListParagraph"/>
         <w:numPr>
           <w:ilvl w:val="0"/>
-          <w:numId w:val="4"/>
+          <w:numId w:val="6"/>
         </w:numPr>
         <w:spacing w:after="80" w:line="276"/>
       </w:pPr>
@@ -1237,7 +1656,7 @@
         <w:pStyle w:val="ListParagraph"/>
         <w:numPr>
           <w:ilvl w:val="0"/>
-          <w:numId w:val="4"/>
+          <w:numId w:val="6"/>
         </w:numPr>
         <w:spacing w:after="80" w:line="276"/>
       </w:pPr>
@@ -1269,343 +1688,6 @@
             <wp:extent cx="4953000" cy="2771775"/>
             <wp:effectExtent t="0" r="0" b="0" l="0"/>
             <wp:docPr id="1" name="chorus.png" descr="Annuaire de la facturation électronique : bouton Déposer" title="Annuaire de la facturation électronique : bouton Déposer"/>
-            <wp:cNvGraphicFramePr>
-              <a:graphicFrameLocks xmlns:a="http://schemas.openxmlformats.org/drawingml/2006/main" noChangeAspect="1"/>
-            </wp:cNvGraphicFramePr>
-            <a:graphic xmlns:a="http://schemas.openxmlformats.org/drawingml/2006/main">
-              <a:graphicData uri="http://schemas.openxmlformats.org/drawingml/2006/picture">
-                <pic:pic xmlns:pic="http://schemas.openxmlformats.org/drawingml/2006/picture">
-                  <pic:nvPicPr>
-                    <pic:cNvPr id="0" name="" descr=""/>
-                    <pic:cNvPicPr>
-                      <a:picLocks noChangeAspect="1" noChangeArrowheads="1"/>
-                    </pic:cNvPicPr>
-                  </pic:nvPicPr>
-                  <pic:blipFill>
-                    <a:blip r:embed="rId10" cstate="none"/>
-                    <a:srcRect/>
-                    <a:stretch>
-                      <a:fillRect/>
-                    </a:stretch>
-                  </pic:blipFill>
-                  <pic:spPr bwMode="auto">
-                    <a:xfrm>
-                      <a:off x="0" y="0"/>
-                      <a:ext cx="4953000" cy="2771775"/>
-                    </a:xfrm>
-                    <a:prstGeom prst="rect">
-                      <a:avLst/>
-                    </a:prstGeom>
-                  </pic:spPr>
-                </pic:pic>
-              </a:graphicData>
-            </a:graphic>
-          </wp:inline>
-        </w:drawing>
-      </w:r>
-    </w:p>
-    <w:p>
-      <w:pPr>
-        <w:spacing w:after="200"/>
-        <w:jc w:val="center"/>
-      </w:pPr>
-      <w:r>
-        <w:rPr>
-          <w:b/>
-          <w:bCs/>
-          <w:color w:val="5D6779"/>
-          <w:sz w:val="18"/>
-          <w:szCs w:val="18"/>
-        </w:rPr>
-        <w:t xml:space="preserve">Figure 2 – </w:t>
-      </w:r>
-      <w:r>
-        <w:rPr>
-          <w:i/>
-          <w:iCs/>
-          <w:color w:val="5D6779"/>
-          <w:sz w:val="18"/>
-          <w:szCs w:val="18"/>
-        </w:rPr>
-        <w:t xml:space="preserve">Annuaire de la facturation électronique : bouton Déposer</w:t>
-      </w:r>
-    </w:p>
-    <w:p>
-      <w:pPr>
-        <w:pStyle w:val="Heading2"/>
-        <w:pageBreakBefore/>
-      </w:pPr>
-      <w:r>
-        <w:t xml:space="preserve">Étape 3 – Importer les adresses de facturation</w:t>
-      </w:r>
-    </w:p>
-    <w:p>
-      <w:pPr>
-        <w:pStyle w:val="ListParagraph"/>
-        <w:numPr>
-          <w:ilvl w:val="0"/>
-          <w:numId w:val="5"/>
-        </w:numPr>
-        <w:spacing w:after="80" w:line="276"/>
-      </w:pPr>
-      <w:r>
-        <w:t xml:space="preserve">Cliquez sur </w:t>
-      </w:r>
-      <w:r>
-        <w:rPr>
-          <w:b/>
-          <w:bCs/>
-        </w:rPr>
-        <w:t xml:space="preserve">Choisir le fichier…</w:t>
-      </w:r>
-      <w:r>
-        <w:t xml:space="preserve"> et sélectionnez </w:t>
-      </w:r>
-      <w:r>
-        <w:rPr>
-          <w:rFonts w:ascii="Consolas" w:cs="Consolas" w:eastAsia="Consolas" w:hAnsi="Consolas"/>
-          <w:color w:val="263238"/>
-          <w:sz w:val="19"/>
-          <w:szCs w:val="19"/>
-        </w:rPr>
-        <w:t xml:space="preserve">adresses_de_facturation.csv</w:t>
-      </w:r>
-      <w:r>
-        <w:t xml:space="preserve">.</w:t>
-      </w:r>
-    </w:p>
-    <w:p>
-      <w:pPr>
-        <w:pStyle w:val="ListParagraph"/>
-        <w:numPr>
-          <w:ilvl w:val="0"/>
-          <w:numId w:val="5"/>
-        </w:numPr>
-        <w:spacing w:after="80" w:line="276"/>
-      </w:pPr>
-      <w:r>
-        <w:t xml:space="preserve">Cliquez sur </w:t>
-      </w:r>
-      <w:r>
-        <w:rPr>
-          <w:b/>
-          <w:bCs/>
-        </w:rPr>
-        <w:t xml:space="preserve">Importer</w:t>
-      </w:r>
-      <w:r>
-        <w:t xml:space="preserve"> et lisez le compte rendu.</w:t>
-      </w:r>
-    </w:p>
-    <w:p>
-      <w:pPr>
-        <w:spacing w:after="120" w:line="288"/>
-      </w:pPr>
-      <w:r>
-        <w:t xml:space="preserve">L'application lit la colonne 1 (SIREN) et la colonne 4 (adresse de facturation = maille) :</w:t>
-      </w:r>
-    </w:p>
-    <w:p>
-      <w:pPr>
-        <w:pStyle w:val="ListParagraph"/>
-        <w:numPr>
-          <w:ilvl w:val="0"/>
-          <w:numId w:val="6"/>
-        </w:numPr>
-        <w:spacing w:after="60" w:line="276"/>
-      </w:pPr>
-      <w:r>
-        <w:t xml:space="preserve">une maille </w:t>
-      </w:r>
-      <w:r>
-        <w:rPr>
-          <w:b/>
-          <w:bCs/>
-        </w:rPr>
-        <w:t xml:space="preserve">absente</w:t>
-      </w:r>
-      <w:r>
-        <w:t xml:space="preserve"> est ajoutée au statut </w:t>
-      </w:r>
-      <w:r>
-        <w:rPr>
-          <w:b/>
-          <w:bCs/>
-        </w:rPr>
-        <w:t xml:space="preserve">Nouveau</w:t>
-      </w:r>
-      <w:r>
-        <w:t xml:space="preserve"> ;</w:t>
-      </w:r>
-    </w:p>
-    <w:p>
-      <w:pPr>
-        <w:pStyle w:val="ListParagraph"/>
-        <w:numPr>
-          <w:ilvl w:val="0"/>
-          <w:numId w:val="6"/>
-        </w:numPr>
-        <w:spacing w:after="60" w:line="276"/>
-      </w:pPr>
-      <w:r>
-        <w:t xml:space="preserve">une maille </w:t>
-      </w:r>
-      <w:r>
-        <w:rPr>
-          <w:b/>
-          <w:bCs/>
-        </w:rPr>
-        <w:t xml:space="preserve">déjà présente</w:t>
-      </w:r>
-      <w:r>
-        <w:t xml:space="preserve"> n'est pas importée et garde son statut ;</w:t>
-      </w:r>
-    </w:p>
-    <w:p>
-      <w:pPr>
-        <w:pStyle w:val="ListParagraph"/>
-        <w:numPr>
-          <w:ilvl w:val="0"/>
-          <w:numId w:val="6"/>
-        </w:numPr>
-        <w:spacing w:after="60" w:line="276"/>
-      </w:pPr>
-      <w:r>
-        <w:t xml:space="preserve">une ligne sans SIREN valide ou sans maille est ignorée et signalée avec son numéro.</w:t>
-      </w:r>
-    </w:p>
-    <w:p>
-      <w:pPr>
-        <w:keepNext/>
-        <w:spacing w:after="60" w:before="120"/>
-        <w:jc w:val="center"/>
-      </w:pPr>
-      <w:r>
-        <w:drawing>
-          <wp:inline distT="0" distB="0" distL="0" distR="0">
-            <wp:extent cx="5334000" cy="2428875"/>
-            <wp:effectExtent t="0" r="0" b="0" l="0"/>
-            <wp:docPr id="1" name="import-resultat.png" descr="Compte rendu d'import" title="Compte rendu d'import"/>
-            <wp:cNvGraphicFramePr>
-              <a:graphicFrameLocks xmlns:a="http://schemas.openxmlformats.org/drawingml/2006/main" noChangeAspect="1"/>
-            </wp:cNvGraphicFramePr>
-            <a:graphic xmlns:a="http://schemas.openxmlformats.org/drawingml/2006/main">
-              <a:graphicData uri="http://schemas.openxmlformats.org/drawingml/2006/picture">
-                <pic:pic xmlns:pic="http://schemas.openxmlformats.org/drawingml/2006/picture">
-                  <pic:nvPicPr>
-                    <pic:cNvPr id="0" name="" descr=""/>
-                    <pic:cNvPicPr>
-                      <a:picLocks noChangeAspect="1" noChangeArrowheads="1"/>
-                    </pic:cNvPicPr>
-                  </pic:nvPicPr>
-                  <pic:blipFill>
-                    <a:blip r:embed="rId11" cstate="none"/>
-                    <a:srcRect/>
-                    <a:stretch>
-                      <a:fillRect/>
-                    </a:stretch>
-                  </pic:blipFill>
-                  <pic:spPr bwMode="auto">
-                    <a:xfrm>
-                      <a:off x="0" y="0"/>
-                      <a:ext cx="5334000" cy="2428875"/>
-                    </a:xfrm>
-                    <a:prstGeom prst="rect">
-                      <a:avLst/>
-                    </a:prstGeom>
-                  </pic:spPr>
-                </pic:pic>
-              </a:graphicData>
-            </a:graphic>
-          </wp:inline>
-        </w:drawing>
-      </w:r>
-    </w:p>
-    <w:p>
-      <w:pPr>
-        <w:spacing w:after="200"/>
-        <w:jc w:val="center"/>
-      </w:pPr>
-      <w:r>
-        <w:rPr>
-          <w:b/>
-          <w:bCs/>
-          <w:color w:val="5D6779"/>
-          <w:sz w:val="18"/>
-          <w:szCs w:val="18"/>
-        </w:rPr>
-        <w:t xml:space="preserve">Figure 3 – </w:t>
-      </w:r>
-      <w:r>
-        <w:rPr>
-          <w:i/>
-          <w:iCs/>
-          <w:color w:val="5D6779"/>
-          <w:sz w:val="18"/>
-          <w:szCs w:val="18"/>
-        </w:rPr>
-        <w:t xml:space="preserve">Compte rendu d'import</w:t>
-      </w:r>
-    </w:p>
-    <w:p>
-      <w:pPr>
-        <w:pStyle w:val="Heading1"/>
-        <w:pageBreakBefore/>
-      </w:pPr>
-      <w:r>
-        <w:t xml:space="preserve">3. Traitement des mailles</w:t>
-      </w:r>
-    </w:p>
-    <w:p>
-      <w:pPr>
-        <w:spacing w:after="120" w:line="288"/>
-      </w:pPr>
-      <w:r>
-        <w:t xml:space="preserve">Toute maille arrive au statut </w:t>
-      </w:r>
-      <w:r>
-        <w:rPr>
-          <w:b/>
-          <w:bCs/>
-        </w:rPr>
-        <w:t xml:space="preserve">Nouveau</w:t>
-      </w:r>
-      <w:r>
-        <w:t xml:space="preserve">, puis un utilisateur la qualifie </w:t>
-      </w:r>
-      <w:r>
-        <w:rPr>
-          <w:b/>
-          <w:bCs/>
-        </w:rPr>
-        <w:t xml:space="preserve">Légitime</w:t>
-      </w:r>
-      <w:r>
-        <w:t xml:space="preserve"> ou </w:t>
-      </w:r>
-      <w:r>
-        <w:rPr>
-          <w:b/>
-          <w:bCs/>
-        </w:rPr>
-        <w:t xml:space="preserve">Non légitime</w:t>
-      </w:r>
-      <w:r>
-        <w:t xml:space="preserve">. Un import ne modifie jamais un statut, et une décision peut être corrigée à tout moment.</w:t>
-      </w:r>
-    </w:p>
-    <w:p>
-      <w:pPr>
-        <w:keepNext/>
-        <w:spacing w:after="60" w:before="120"/>
-        <w:jc w:val="center"/>
-      </w:pPr>
-      <w:r>
-        <w:drawing>
-          <wp:inline distT="0" distB="0" distL="0" distR="0">
-            <wp:extent cx="5334000" cy="3067050"/>
-            <wp:effectExtent t="0" r="0" b="0" l="0"/>
-            <wp:docPr id="1" name="mailles.png" descr="Onglet Mailles : répartition par statut et liste" title="Onglet Mailles : répartition par statut et liste"/>
             <wp:cNvGraphicFramePr>
               <a:graphicFrameLocks xmlns:a="http://schemas.openxmlformats.org/drawingml/2006/main" noChangeAspect="1"/>
             </wp:cNvGraphicFramePr>
@@ -1628,6 +1710,343 @@
                   <pic:spPr bwMode="auto">
                     <a:xfrm>
                       <a:off x="0" y="0"/>
+                      <a:ext cx="4953000" cy="2771775"/>
+                    </a:xfrm>
+                    <a:prstGeom prst="rect">
+                      <a:avLst/>
+                    </a:prstGeom>
+                  </pic:spPr>
+                </pic:pic>
+              </a:graphicData>
+            </a:graphic>
+          </wp:inline>
+        </w:drawing>
+      </w:r>
+    </w:p>
+    <w:p>
+      <w:pPr>
+        <w:spacing w:after="200"/>
+        <w:jc w:val="center"/>
+      </w:pPr>
+      <w:r>
+        <w:rPr>
+          <w:b/>
+          <w:bCs/>
+          <w:color w:val="5D6779"/>
+          <w:sz w:val="18"/>
+          <w:szCs w:val="18"/>
+        </w:rPr>
+        <w:t xml:space="preserve">Figure 4 – </w:t>
+      </w:r>
+      <w:r>
+        <w:rPr>
+          <w:i/>
+          <w:iCs/>
+          <w:color w:val="5D6779"/>
+          <w:sz w:val="18"/>
+          <w:szCs w:val="18"/>
+        </w:rPr>
+        <w:t xml:space="preserve">Annuaire de la facturation électronique : bouton Déposer</w:t>
+      </w:r>
+    </w:p>
+    <w:p>
+      <w:pPr>
+        <w:pStyle w:val="Heading2"/>
+        <w:pageBreakBefore/>
+      </w:pPr>
+      <w:r>
+        <w:t xml:space="preserve">Étape 3 – Importer les adresses de facturation</w:t>
+      </w:r>
+    </w:p>
+    <w:p>
+      <w:pPr>
+        <w:pStyle w:val="ListParagraph"/>
+        <w:numPr>
+          <w:ilvl w:val="0"/>
+          <w:numId w:val="7"/>
+        </w:numPr>
+        <w:spacing w:after="80" w:line="276"/>
+      </w:pPr>
+      <w:r>
+        <w:t xml:space="preserve">Cliquez sur </w:t>
+      </w:r>
+      <w:r>
+        <w:rPr>
+          <w:b/>
+          <w:bCs/>
+        </w:rPr>
+        <w:t xml:space="preserve">Choisir le fichier…</w:t>
+      </w:r>
+      <w:r>
+        <w:t xml:space="preserve"> et sélectionnez </w:t>
+      </w:r>
+      <w:r>
+        <w:rPr>
+          <w:rFonts w:ascii="Consolas" w:cs="Consolas" w:eastAsia="Consolas" w:hAnsi="Consolas"/>
+          <w:color w:val="263238"/>
+          <w:sz w:val="19"/>
+          <w:szCs w:val="19"/>
+        </w:rPr>
+        <w:t xml:space="preserve">adresses_de_facturation.csv</w:t>
+      </w:r>
+      <w:r>
+        <w:t xml:space="preserve">.</w:t>
+      </w:r>
+    </w:p>
+    <w:p>
+      <w:pPr>
+        <w:pStyle w:val="ListParagraph"/>
+        <w:numPr>
+          <w:ilvl w:val="0"/>
+          <w:numId w:val="7"/>
+        </w:numPr>
+        <w:spacing w:after="80" w:line="276"/>
+      </w:pPr>
+      <w:r>
+        <w:t xml:space="preserve">Cliquez sur </w:t>
+      </w:r>
+      <w:r>
+        <w:rPr>
+          <w:b/>
+          <w:bCs/>
+        </w:rPr>
+        <w:t xml:space="preserve">Importer</w:t>
+      </w:r>
+      <w:r>
+        <w:t xml:space="preserve"> et lisez le compte rendu.</w:t>
+      </w:r>
+    </w:p>
+    <w:p>
+      <w:pPr>
+        <w:spacing w:after="120" w:line="288"/>
+      </w:pPr>
+      <w:r>
+        <w:t xml:space="preserve">L'application lit la colonne 1 (SIREN) et la colonne 4 (adresse de facturation = maille) :</w:t>
+      </w:r>
+    </w:p>
+    <w:p>
+      <w:pPr>
+        <w:pStyle w:val="ListParagraph"/>
+        <w:numPr>
+          <w:ilvl w:val="0"/>
+          <w:numId w:val="3"/>
+        </w:numPr>
+        <w:spacing w:after="60" w:line="276"/>
+      </w:pPr>
+      <w:r>
+        <w:t xml:space="preserve">une maille </w:t>
+      </w:r>
+      <w:r>
+        <w:rPr>
+          <w:b/>
+          <w:bCs/>
+        </w:rPr>
+        <w:t xml:space="preserve">absente</w:t>
+      </w:r>
+      <w:r>
+        <w:t xml:space="preserve"> est ajoutée au statut </w:t>
+      </w:r>
+      <w:r>
+        <w:rPr>
+          <w:b/>
+          <w:bCs/>
+        </w:rPr>
+        <w:t xml:space="preserve">Nouveau</w:t>
+      </w:r>
+      <w:r>
+        <w:t xml:space="preserve"> ;</w:t>
+      </w:r>
+    </w:p>
+    <w:p>
+      <w:pPr>
+        <w:pStyle w:val="ListParagraph"/>
+        <w:numPr>
+          <w:ilvl w:val="0"/>
+          <w:numId w:val="3"/>
+        </w:numPr>
+        <w:spacing w:after="60" w:line="276"/>
+      </w:pPr>
+      <w:r>
+        <w:t xml:space="preserve">une maille </w:t>
+      </w:r>
+      <w:r>
+        <w:rPr>
+          <w:b/>
+          <w:bCs/>
+        </w:rPr>
+        <w:t xml:space="preserve">déjà présente</w:t>
+      </w:r>
+      <w:r>
+        <w:t xml:space="preserve"> n'est pas importée et garde son statut ;</w:t>
+      </w:r>
+    </w:p>
+    <w:p>
+      <w:pPr>
+        <w:pStyle w:val="ListParagraph"/>
+        <w:numPr>
+          <w:ilvl w:val="0"/>
+          <w:numId w:val="3"/>
+        </w:numPr>
+        <w:spacing w:after="60" w:line="276"/>
+      </w:pPr>
+      <w:r>
+        <w:t xml:space="preserve">une ligne sans SIREN valide ou sans maille est ignorée et signalée avec son numéro.</w:t>
+      </w:r>
+    </w:p>
+    <w:p>
+      <w:pPr>
+        <w:keepNext/>
+        <w:spacing w:after="60" w:before="120"/>
+        <w:jc w:val="center"/>
+      </w:pPr>
+      <w:r>
+        <w:drawing>
+          <wp:inline distT="0" distB="0" distL="0" distR="0">
+            <wp:extent cx="5334000" cy="2428875"/>
+            <wp:effectExtent t="0" r="0" b="0" l="0"/>
+            <wp:docPr id="1" name="import-resultat.png" descr="Compte rendu d'import" title="Compte rendu d'import"/>
+            <wp:cNvGraphicFramePr>
+              <a:graphicFrameLocks xmlns:a="http://schemas.openxmlformats.org/drawingml/2006/main" noChangeAspect="1"/>
+            </wp:cNvGraphicFramePr>
+            <a:graphic xmlns:a="http://schemas.openxmlformats.org/drawingml/2006/main">
+              <a:graphicData uri="http://schemas.openxmlformats.org/drawingml/2006/picture">
+                <pic:pic xmlns:pic="http://schemas.openxmlformats.org/drawingml/2006/picture">
+                  <pic:nvPicPr>
+                    <pic:cNvPr id="0" name="" descr=""/>
+                    <pic:cNvPicPr>
+                      <a:picLocks noChangeAspect="1" noChangeArrowheads="1"/>
+                    </pic:cNvPicPr>
+                  </pic:nvPicPr>
+                  <pic:blipFill>
+                    <a:blip r:embed="rId13" cstate="none"/>
+                    <a:srcRect/>
+                    <a:stretch>
+                      <a:fillRect/>
+                    </a:stretch>
+                  </pic:blipFill>
+                  <pic:spPr bwMode="auto">
+                    <a:xfrm>
+                      <a:off x="0" y="0"/>
+                      <a:ext cx="5334000" cy="2428875"/>
+                    </a:xfrm>
+                    <a:prstGeom prst="rect">
+                      <a:avLst/>
+                    </a:prstGeom>
+                  </pic:spPr>
+                </pic:pic>
+              </a:graphicData>
+            </a:graphic>
+          </wp:inline>
+        </w:drawing>
+      </w:r>
+    </w:p>
+    <w:p>
+      <w:pPr>
+        <w:spacing w:after="200"/>
+        <w:jc w:val="center"/>
+      </w:pPr>
+      <w:r>
+        <w:rPr>
+          <w:b/>
+          <w:bCs/>
+          <w:color w:val="5D6779"/>
+          <w:sz w:val="18"/>
+          <w:szCs w:val="18"/>
+        </w:rPr>
+        <w:t xml:space="preserve">Figure 5 – </w:t>
+      </w:r>
+      <w:r>
+        <w:rPr>
+          <w:i/>
+          <w:iCs/>
+          <w:color w:val="5D6779"/>
+          <w:sz w:val="18"/>
+          <w:szCs w:val="18"/>
+        </w:rPr>
+        <w:t xml:space="preserve">Compte rendu d'import</w:t>
+      </w:r>
+    </w:p>
+    <w:p>
+      <w:pPr>
+        <w:pStyle w:val="Heading1"/>
+        <w:pageBreakBefore/>
+      </w:pPr>
+      <w:r>
+        <w:t xml:space="preserve">4. Traitement des mailles</w:t>
+      </w:r>
+    </w:p>
+    <w:p>
+      <w:pPr>
+        <w:spacing w:after="120" w:line="288"/>
+      </w:pPr>
+      <w:r>
+        <w:t xml:space="preserve">Toute maille arrive au statut </w:t>
+      </w:r>
+      <w:r>
+        <w:rPr>
+          <w:b/>
+          <w:bCs/>
+        </w:rPr>
+        <w:t xml:space="preserve">Nouveau</w:t>
+      </w:r>
+      <w:r>
+        <w:t xml:space="preserve">, puis un utilisateur la qualifie </w:t>
+      </w:r>
+      <w:r>
+        <w:rPr>
+          <w:b/>
+          <w:bCs/>
+        </w:rPr>
+        <w:t xml:space="preserve">Légitime</w:t>
+      </w:r>
+      <w:r>
+        <w:t xml:space="preserve"> ou </w:t>
+      </w:r>
+      <w:r>
+        <w:rPr>
+          <w:b/>
+          <w:bCs/>
+        </w:rPr>
+        <w:t xml:space="preserve">Non légitime</w:t>
+      </w:r>
+      <w:r>
+        <w:t xml:space="preserve">. Un import ne modifie jamais un statut, et une décision peut être corrigée à tout moment.</w:t>
+      </w:r>
+    </w:p>
+    <w:p>
+      <w:pPr>
+        <w:keepNext/>
+        <w:spacing w:after="60" w:before="120"/>
+        <w:jc w:val="center"/>
+      </w:pPr>
+      <w:r>
+        <w:drawing>
+          <wp:inline distT="0" distB="0" distL="0" distR="0">
+            <wp:extent cx="5334000" cy="3067050"/>
+            <wp:effectExtent t="0" r="0" b="0" l="0"/>
+            <wp:docPr id="1" name="mailles.png" descr="Onglet Mailles : répartition par statut et liste" title="Onglet Mailles : répartition par statut et liste"/>
+            <wp:cNvGraphicFramePr>
+              <a:graphicFrameLocks xmlns:a="http://schemas.openxmlformats.org/drawingml/2006/main" noChangeAspect="1"/>
+            </wp:cNvGraphicFramePr>
+            <a:graphic xmlns:a="http://schemas.openxmlformats.org/drawingml/2006/main">
+              <a:graphicData uri="http://schemas.openxmlformats.org/drawingml/2006/picture">
+                <pic:pic xmlns:pic="http://schemas.openxmlformats.org/drawingml/2006/picture">
+                  <pic:nvPicPr>
+                    <pic:cNvPr id="0" name="" descr=""/>
+                    <pic:cNvPicPr>
+                      <a:picLocks noChangeAspect="1" noChangeArrowheads="1"/>
+                    </pic:cNvPicPr>
+                  </pic:nvPicPr>
+                  <pic:blipFill>
+                    <a:blip r:embed="rId14" cstate="none"/>
+                    <a:srcRect/>
+                    <a:stretch>
+                      <a:fillRect/>
+                    </a:stretch>
+                  </pic:blipFill>
+                  <pic:spPr bwMode="auto">
+                    <a:xfrm>
+                      <a:off x="0" y="0"/>
                       <a:ext cx="5334000" cy="3067050"/>
                     </a:xfrm>
                     <a:prstGeom prst="rect">
@@ -1654,7 +2073,7 @@
           <w:sz w:val="18"/>
           <w:szCs w:val="18"/>
         </w:rPr>
-        <w:t xml:space="preserve">Figure 4 – </w:t>
+        <w:t xml:space="preserve">Figure 6 – </w:t>
       </w:r>
       <w:r>
         <w:rPr>
@@ -1698,7 +2117,7 @@
         <w:pStyle w:val="ListParagraph"/>
         <w:numPr>
           <w:ilvl w:val="0"/>
-          <w:numId w:val="7"/>
+          <w:numId w:val="8"/>
         </w:numPr>
         <w:spacing w:after="80" w:line="276"/>
       </w:pPr>
@@ -1721,7 +2140,7 @@
         <w:pStyle w:val="ListParagraph"/>
         <w:numPr>
           <w:ilvl w:val="0"/>
-          <w:numId w:val="7"/>
+          <w:numId w:val="8"/>
         </w:numPr>
         <w:spacing w:after="80" w:line="276"/>
       </w:pPr>
@@ -1754,7 +2173,7 @@
         <w:pStyle w:val="ListParagraph"/>
         <w:numPr>
           <w:ilvl w:val="0"/>
-          <w:numId w:val="7"/>
+          <w:numId w:val="8"/>
         </w:numPr>
         <w:spacing w:after="80" w:line="276"/>
       </w:pPr>
@@ -1861,6 +2280,520 @@
       </w:r>
       <w:r>
         <w:t xml:space="preserve"> des lignes affichées (filtres appliqués) : société, SIREN, maille, statut en couleur, date et auteur de la dernière modification.</w:t>
+      </w:r>
+    </w:p>
+    <w:p>
+      <w:pPr>
+        <w:pStyle w:val="Heading1"/>
+        <w:pageBreakBefore/>
+      </w:pPr>
+      <w:r>
+        <w:t xml:space="preserve">5. Gestion des utilisateurs (profil Admin)</w:t>
+      </w:r>
+    </w:p>
+    <w:p>
+      <w:pPr>
+        <w:spacing w:after="120" w:line="288"/>
+      </w:pPr>
+      <w:r>
+        <w:t xml:space="preserve">L'onglet </w:t>
+      </w:r>
+      <w:r>
+        <w:rPr>
+          <w:b/>
+          <w:bCs/>
+        </w:rPr>
+        <w:t xml:space="preserve">Utilisateurs</w:t>
+      </w:r>
+      <w:r>
+        <w:t xml:space="preserve"> n'est visible que des administrateurs. Il liste les adresses autorisées à se connecter, avec leur nom, leur profil et leur dernière connexion.</w:t>
+      </w:r>
+    </w:p>
+    <w:tbl>
+      <w:tblPr>
+        <w:tblW w:type="dxa" w:w="9638"/>
+        <w:tblBorders>
+          <w:top w:val="single" w:color="auto" w:sz="4"/>
+          <w:left w:val="single" w:color="auto" w:sz="4"/>
+          <w:bottom w:val="single" w:color="auto" w:sz="4"/>
+          <w:right w:val="single" w:color="auto" w:sz="4"/>
+          <w:insideH w:val="single" w:color="auto" w:sz="4"/>
+          <w:insideV w:val="single" w:color="auto" w:sz="4"/>
+        </w:tblBorders>
+      </w:tblPr>
+      <w:tblGrid>
+        <w:gridCol w:w="2000"/>
+        <w:gridCol w:w="7638"/>
+      </w:tblGrid>
+      <w:tr>
+        <w:trPr>
+          <w:tblHeader/>
+        </w:trPr>
+        <w:tc>
+          <w:tcPr>
+            <w:tcW w:type="dxa" w:w="2000"/>
+            <w:tcBorders>
+              <w:top w:val="single" w:color="1F3A5F" w:sz="4"/>
+              <w:left w:val="single" w:color="1F3A5F" w:sz="4"/>
+              <w:bottom w:val="single" w:color="1F3A5F" w:sz="4"/>
+              <w:right w:val="single" w:color="1F3A5F" w:sz="4"/>
+            </w:tcBorders>
+            <w:shd w:fill="1F3A5F" w:color="auto" w:val="clear"/>
+            <w:tcMar>
+              <w:top w:type="dxa" w:w="80"/>
+              <w:left w:type="dxa" w:w="120"/>
+              <w:bottom w:type="dxa" w:w="80"/>
+              <w:right w:type="dxa" w:w="120"/>
+            </w:tcMar>
+            <w:vAlign w:val="center"/>
+          </w:tcPr>
+          <w:p>
+            <w:pPr>
+              <w:spacing w:after="40"/>
+            </w:pPr>
+            <w:r>
+              <w:rPr>
+                <w:b/>
+                <w:bCs/>
+                <w:color w:val="FFFFFF"/>
+                <w:sz w:val="19"/>
+                <w:szCs w:val="19"/>
+              </w:rPr>
+              <w:t xml:space="preserve">Profil</w:t>
+            </w:r>
+          </w:p>
+        </w:tc>
+        <w:tc>
+          <w:tcPr>
+            <w:tcW w:type="dxa" w:w="7638"/>
+            <w:tcBorders>
+              <w:top w:val="single" w:color="1F3A5F" w:sz="4"/>
+              <w:left w:val="single" w:color="1F3A5F" w:sz="4"/>
+              <w:bottom w:val="single" w:color="1F3A5F" w:sz="4"/>
+              <w:right w:val="single" w:color="1F3A5F" w:sz="4"/>
+            </w:tcBorders>
+            <w:shd w:fill="1F3A5F" w:color="auto" w:val="clear"/>
+            <w:tcMar>
+              <w:top w:type="dxa" w:w="80"/>
+              <w:left w:type="dxa" w:w="120"/>
+              <w:bottom w:type="dxa" w:w="80"/>
+              <w:right w:type="dxa" w:w="120"/>
+            </w:tcMar>
+            <w:vAlign w:val="center"/>
+          </w:tcPr>
+          <w:p>
+            <w:pPr>
+              <w:spacing w:after="40"/>
+            </w:pPr>
+            <w:r>
+              <w:rPr>
+                <w:b/>
+                <w:bCs/>
+                <w:color w:val="FFFFFF"/>
+                <w:sz w:val="19"/>
+                <w:szCs w:val="19"/>
+              </w:rPr>
+              <w:t xml:space="preserve">Accès</w:t>
+            </w:r>
+          </w:p>
+        </w:tc>
+      </w:tr>
+      <w:tr>
+        <w:trPr>
+          <w:cantSplit/>
+        </w:trPr>
+        <w:tc>
+          <w:tcPr>
+            <w:tcW w:type="dxa" w:w="2000"/>
+            <w:tcBorders>
+              <w:top w:val="single" w:color="C4CAD4" w:sz="4"/>
+              <w:left w:val="single" w:color="C4CAD4" w:sz="4"/>
+              <w:bottom w:val="single" w:color="C4CAD4" w:sz="4"/>
+              <w:right w:val="single" w:color="C4CAD4" w:sz="4"/>
+            </w:tcBorders>
+            <w:tcMar>
+              <w:top w:type="dxa" w:w="80"/>
+              <w:left w:type="dxa" w:w="120"/>
+              <w:bottom w:type="dxa" w:w="80"/>
+              <w:right w:type="dxa" w:w="120"/>
+            </w:tcMar>
+            <w:vAlign w:val="center"/>
+          </w:tcPr>
+          <w:p>
+            <w:pPr>
+              <w:spacing w:after="40"/>
+            </w:pPr>
+            <w:r>
+              <w:rPr>
+                <w:b/>
+                <w:bCs/>
+              </w:rPr>
+              <w:t xml:space="preserve">Admin</w:t>
+            </w:r>
+          </w:p>
+        </w:tc>
+        <w:tc>
+          <w:tcPr>
+            <w:tcW w:type="dxa" w:w="7638"/>
+            <w:tcBorders>
+              <w:top w:val="single" w:color="C4CAD4" w:sz="4"/>
+              <w:left w:val="single" w:color="C4CAD4" w:sz="4"/>
+              <w:bottom w:val="single" w:color="C4CAD4" w:sz="4"/>
+              <w:right w:val="single" w:color="C4CAD4" w:sz="4"/>
+            </w:tcBorders>
+            <w:tcMar>
+              <w:top w:type="dxa" w:w="80"/>
+              <w:left w:type="dxa" w:w="120"/>
+              <w:bottom w:type="dxa" w:w="80"/>
+              <w:right w:type="dxa" w:w="120"/>
+            </w:tcMar>
+            <w:vAlign w:val="center"/>
+          </w:tcPr>
+          <w:p>
+            <w:pPr>
+              <w:spacing w:after="40"/>
+            </w:pPr>
+            <w:r>
+              <w:t xml:space="preserve">Tous les onglets, dont Utilisateurs.</w:t>
+            </w:r>
+          </w:p>
+        </w:tc>
+      </w:tr>
+      <w:tr>
+        <w:trPr>
+          <w:cantSplit/>
+        </w:trPr>
+        <w:tc>
+          <w:tcPr>
+            <w:tcW w:type="dxa" w:w="2000"/>
+            <w:tcBorders>
+              <w:top w:val="single" w:color="C4CAD4" w:sz="4"/>
+              <w:left w:val="single" w:color="C4CAD4" w:sz="4"/>
+              <w:bottom w:val="single" w:color="C4CAD4" w:sz="4"/>
+              <w:right w:val="single" w:color="C4CAD4" w:sz="4"/>
+            </w:tcBorders>
+            <w:shd w:fill="F2F4F7" w:color="auto" w:val="clear"/>
+            <w:tcMar>
+              <w:top w:type="dxa" w:w="80"/>
+              <w:left w:type="dxa" w:w="120"/>
+              <w:bottom w:type="dxa" w:w="80"/>
+              <w:right w:type="dxa" w:w="120"/>
+            </w:tcMar>
+            <w:vAlign w:val="center"/>
+          </w:tcPr>
+          <w:p>
+            <w:pPr>
+              <w:spacing w:after="40"/>
+            </w:pPr>
+            <w:r>
+              <w:rPr>
+                <w:b/>
+                <w:bCs/>
+              </w:rPr>
+              <w:t xml:space="preserve">User</w:t>
+            </w:r>
+          </w:p>
+        </w:tc>
+        <w:tc>
+          <w:tcPr>
+            <w:tcW w:type="dxa" w:w="7638"/>
+            <w:tcBorders>
+              <w:top w:val="single" w:color="C4CAD4" w:sz="4"/>
+              <w:left w:val="single" w:color="C4CAD4" w:sz="4"/>
+              <w:bottom w:val="single" w:color="C4CAD4" w:sz="4"/>
+              <w:right w:val="single" w:color="C4CAD4" w:sz="4"/>
+            </w:tcBorders>
+            <w:shd w:fill="F2F4F7" w:color="auto" w:val="clear"/>
+            <w:tcMar>
+              <w:top w:type="dxa" w:w="80"/>
+              <w:left w:type="dxa" w:w="120"/>
+              <w:bottom w:type="dxa" w:w="80"/>
+              <w:right w:type="dxa" w:w="120"/>
+            </w:tcMar>
+            <w:vAlign w:val="center"/>
+          </w:tcPr>
+          <w:p>
+            <w:pPr>
+              <w:spacing w:after="40"/>
+            </w:pPr>
+            <w:r>
+              <w:t xml:space="preserve">Mailles, Sociétés et Import / export.</w:t>
+            </w:r>
+          </w:p>
+        </w:tc>
+      </w:tr>
+    </w:tbl>
+    <w:p>
+      <w:pPr>
+        <w:spacing w:after="120"/>
+      </w:pPr>
+    </w:p>
+    <w:p>
+      <w:pPr>
+        <w:keepNext/>
+        <w:spacing w:after="60" w:before="120"/>
+        <w:jc w:val="center"/>
+      </w:pPr>
+      <w:r>
+        <w:drawing>
+          <wp:inline distT="0" distB="0" distL="0" distR="0">
+            <wp:extent cx="5334000" cy="1447800"/>
+            <wp:effectExtent t="0" r="0" b="0" l="0"/>
+            <wp:docPr id="1" name="utilisateurs.png" descr="Onglet Utilisateurs" title="Onglet Utilisateurs"/>
+            <wp:cNvGraphicFramePr>
+              <a:graphicFrameLocks xmlns:a="http://schemas.openxmlformats.org/drawingml/2006/main" noChangeAspect="1"/>
+            </wp:cNvGraphicFramePr>
+            <a:graphic xmlns:a="http://schemas.openxmlformats.org/drawingml/2006/main">
+              <a:graphicData uri="http://schemas.openxmlformats.org/drawingml/2006/picture">
+                <pic:pic xmlns:pic="http://schemas.openxmlformats.org/drawingml/2006/picture">
+                  <pic:nvPicPr>
+                    <pic:cNvPr id="0" name="" descr=""/>
+                    <pic:cNvPicPr>
+                      <a:picLocks noChangeAspect="1" noChangeArrowheads="1"/>
+                    </pic:cNvPicPr>
+                  </pic:nvPicPr>
+                  <pic:blipFill>
+                    <a:blip r:embed="rId15" cstate="none"/>
+                    <a:srcRect/>
+                    <a:stretch>
+                      <a:fillRect/>
+                    </a:stretch>
+                  </pic:blipFill>
+                  <pic:spPr bwMode="auto">
+                    <a:xfrm>
+                      <a:off x="0" y="0"/>
+                      <a:ext cx="5334000" cy="1447800"/>
+                    </a:xfrm>
+                    <a:prstGeom prst="rect">
+                      <a:avLst/>
+                    </a:prstGeom>
+                  </pic:spPr>
+                </pic:pic>
+              </a:graphicData>
+            </a:graphic>
+          </wp:inline>
+        </w:drawing>
+      </w:r>
+    </w:p>
+    <w:p>
+      <w:pPr>
+        <w:spacing w:after="200"/>
+        <w:jc w:val="center"/>
+      </w:pPr>
+      <w:r>
+        <w:rPr>
+          <w:b/>
+          <w:bCs/>
+          <w:color w:val="5D6779"/>
+          <w:sz w:val="18"/>
+          <w:szCs w:val="18"/>
+        </w:rPr>
+        <w:t xml:space="preserve">Figure 7 – </w:t>
+      </w:r>
+      <w:r>
+        <w:rPr>
+          <w:i/>
+          <w:iCs/>
+          <w:color w:val="5D6779"/>
+          <w:sz w:val="18"/>
+          <w:szCs w:val="18"/>
+        </w:rPr>
+        <w:t xml:space="preserve">Onglet Utilisateurs</w:t>
+      </w:r>
+    </w:p>
+    <w:p>
+      <w:pPr>
+        <w:pStyle w:val="Heading3"/>
+      </w:pPr>
+      <w:r>
+        <w:t xml:space="preserve">Ajouter un utilisateur</w:t>
+      </w:r>
+    </w:p>
+    <w:p>
+      <w:pPr>
+        <w:pStyle w:val="ListParagraph"/>
+        <w:numPr>
+          <w:ilvl w:val="0"/>
+          <w:numId w:val="9"/>
+        </w:numPr>
+        <w:spacing w:after="80" w:line="276"/>
+      </w:pPr>
+      <w:r>
+        <w:t xml:space="preserve">Saisissez l'</w:t>
+      </w:r>
+      <w:r>
+        <w:rPr>
+          <w:b/>
+          <w:bCs/>
+        </w:rPr>
+        <w:t xml:space="preserve">adresse mail</w:t>
+      </w:r>
+      <w:r>
+        <w:t xml:space="preserve">, éventuellement le </w:t>
+      </w:r>
+      <w:r>
+        <w:rPr>
+          <w:b/>
+          <w:bCs/>
+        </w:rPr>
+        <w:t xml:space="preserve">nom</w:t>
+      </w:r>
+      <w:r>
+        <w:t xml:space="preserve">, et choisissez le </w:t>
+      </w:r>
+      <w:r>
+        <w:rPr>
+          <w:b/>
+          <w:bCs/>
+        </w:rPr>
+        <w:t xml:space="preserve">profil</w:t>
+      </w:r>
+      <w:r>
+        <w:t xml:space="preserve">.</w:t>
+      </w:r>
+    </w:p>
+    <w:p>
+      <w:pPr>
+        <w:pStyle w:val="ListParagraph"/>
+        <w:numPr>
+          <w:ilvl w:val="0"/>
+          <w:numId w:val="9"/>
+        </w:numPr>
+        <w:spacing w:after="80" w:line="276"/>
+      </w:pPr>
+      <w:r>
+        <w:t xml:space="preserve">Cliquez sur </w:t>
+      </w:r>
+      <w:r>
+        <w:rPr>
+          <w:b/>
+          <w:bCs/>
+        </w:rPr>
+        <w:t xml:space="preserve">Ajouter</w:t>
+      </w:r>
+      <w:r>
+        <w:t xml:space="preserve">. La personne peut se connecter immédiatement.</w:t>
+      </w:r>
+    </w:p>
+    <w:p>
+      <w:pPr>
+        <w:pStyle w:val="Heading3"/>
+      </w:pPr>
+      <w:r>
+        <w:t xml:space="preserve">Modifier ou supprimer un utilisateur</w:t>
+      </w:r>
+    </w:p>
+    <w:p>
+      <w:pPr>
+        <w:pStyle w:val="ListParagraph"/>
+        <w:numPr>
+          <w:ilvl w:val="0"/>
+          <w:numId w:val="3"/>
+        </w:numPr>
+        <w:spacing w:after="60" w:line="276"/>
+      </w:pPr>
+      <w:r>
+        <w:t xml:space="preserve">Le </w:t>
+      </w:r>
+      <w:r>
+        <w:rPr>
+          <w:b/>
+          <w:bCs/>
+        </w:rPr>
+        <w:t xml:space="preserve">nom</w:t>
+      </w:r>
+      <w:r>
+        <w:t xml:space="preserve"> se modifie directement dans la liste (Entrée pour valider, Échap pour annuler).</w:t>
+      </w:r>
+    </w:p>
+    <w:p>
+      <w:pPr>
+        <w:pStyle w:val="ListParagraph"/>
+        <w:numPr>
+          <w:ilvl w:val="0"/>
+          <w:numId w:val="3"/>
+        </w:numPr>
+        <w:spacing w:after="60" w:line="276"/>
+      </w:pPr>
+      <w:r>
+        <w:t xml:space="preserve">Le </w:t>
+      </w:r>
+      <w:r>
+        <w:rPr>
+          <w:b/>
+          <w:bCs/>
+        </w:rPr>
+        <w:t xml:space="preserve">profil</w:t>
+      </w:r>
+      <w:r>
+        <w:t xml:space="preserve"> se change dans la liste déroulante.</w:t>
+      </w:r>
+    </w:p>
+    <w:p>
+      <w:pPr>
+        <w:pStyle w:val="ListParagraph"/>
+        <w:numPr>
+          <w:ilvl w:val="0"/>
+          <w:numId w:val="3"/>
+        </w:numPr>
+        <w:spacing w:after="60" w:line="276"/>
+      </w:pPr>
+      <w:r>
+        <w:t xml:space="preserve">La </w:t>
+      </w:r>
+      <w:r>
+        <w:rPr>
+          <w:b/>
+          <w:bCs/>
+        </w:rPr>
+        <w:t xml:space="preserve">corbeille</w:t>
+      </w:r>
+      <w:r>
+        <w:t xml:space="preserve"> supprime l'utilisateur après confirmation : il ne peut plus se connecter.</w:t>
+      </w:r>
+    </w:p>
+    <w:p>
+      <w:pPr>
+        <w:spacing w:after="120" w:line="288"/>
+      </w:pPr>
+      <w:r>
+        <w:t xml:space="preserve">Ces changements s'appliquent </w:t>
+      </w:r>
+      <w:r>
+        <w:rPr>
+          <w:b/>
+          <w:bCs/>
+        </w:rPr>
+        <w:t xml:space="preserve">immédiatement</w:t>
+      </w:r>
+      <w:r>
+        <w:t xml:space="preserve">, y compris à une session déjà ouverte. Par sécurité, vous ne pouvez ni supprimer votre propre compte ni modifier votre propre profil, et il reste toujours au moins un administrateur.</w:t>
+      </w:r>
+    </w:p>
+    <w:p>
+      <w:pPr>
+        <w:pStyle w:val="Heading3"/>
+      </w:pPr>
+      <w:r>
+        <w:t xml:space="preserve">Tester l'envoi des mails</w:t>
+      </w:r>
+    </w:p>
+    <w:p>
+      <w:pPr>
+        <w:spacing w:after="120" w:line="288"/>
+      </w:pPr>
+      <w:r>
+        <w:t xml:space="preserve">Le bouton </w:t>
+      </w:r>
+      <w:r>
+        <w:rPr>
+          <w:b/>
+          <w:bCs/>
+        </w:rPr>
+        <w:t xml:space="preserve">Tester l'envoi des mails</w:t>
+      </w:r>
+      <w:r>
+        <w:t xml:space="preserve"> envoie un mail de test à votre adresse et affiche le résultat du serveur de messagerie : en vert, le mail a été accepté ; en rouge, le message d'erreur à transmettre à l'administrateur du serveur.</w:t>
       </w:r>
     </w:p>
     <w:sectPr>
@@ -2028,7 +2961,7 @@
         <w:sz w:val="17"/>
         <w:szCs w:val="17"/>
       </w:rPr>
-      <w:t xml:space="preserve">	Guide utilisateur – version 1.1</w:t>
+      <w:t xml:space="preserve">	Guide utilisateur – version 1.2</w:t>
     </w:r>
   </w:p>
 </w:hdr>
@@ -2210,6 +3143,40 @@
     </w:lvl>
   </w:abstractNum>
   <w:abstractNum w:abstractNumId="7" w15:restartNumberingAfterBreak="0">
+    <w:multiLevelType w:val="hybridMultilevel"/>
+    <w:lvl w:ilvl="0" w15:tentative="1">
+      <w:start w:val="1"/>
+      <w:numFmt w:val="decimal"/>
+      <w:lvlText w:val="%1."/>
+      <w:lvlJc w:val="left"/>
+      <w:pPr>
+        <w:ind w:left="540" w:hanging="360"/>
+      </w:pPr>
+      <w:rPr>
+        <w:b/>
+        <w:bCs/>
+        <w:color w:val="1F5FD1"/>
+      </w:rPr>
+    </w:lvl>
+  </w:abstractNum>
+  <w:abstractNum w:abstractNumId="8" w15:restartNumberingAfterBreak="0">
+    <w:multiLevelType w:val="hybridMultilevel"/>
+    <w:lvl w:ilvl="0" w15:tentative="1">
+      <w:start w:val="1"/>
+      <w:numFmt w:val="decimal"/>
+      <w:lvlText w:val="%1."/>
+      <w:lvlJc w:val="left"/>
+      <w:pPr>
+        <w:ind w:left="540" w:hanging="360"/>
+      </w:pPr>
+      <w:rPr>
+        <w:b/>
+        <w:bCs/>
+        <w:color w:val="1F5FD1"/>
+      </w:rPr>
+    </w:lvl>
+  </w:abstractNum>
+  <w:abstractNum w:abstractNumId="9" w15:restartNumberingAfterBreak="0">
     <w:multiLevelType w:val="hybridMultilevel"/>
     <w:lvl w:ilvl="0" w15:tentative="1">
       <w:start w:val="1"/>
@@ -2239,31 +3206,43 @@
     </w:lvlOverride>
   </w:num>
   <w:num w:numId="3">
+    <w:abstractNumId w:val="2"/>
+    <w:lvlOverride w:ilvl="0">
+      <w:startOverride w:val="1"/>
+    </w:lvlOverride>
+  </w:num>
+  <w:num w:numId="4">
     <w:abstractNumId w:val="4"/>
     <w:lvlOverride w:ilvl="0">
       <w:startOverride w:val="1"/>
     </w:lvlOverride>
   </w:num>
-  <w:num w:numId="4">
+  <w:num w:numId="5">
     <w:abstractNumId w:val="5"/>
     <w:lvlOverride w:ilvl="0">
       <w:startOverride w:val="1"/>
     </w:lvlOverride>
   </w:num>
-  <w:num w:numId="5">
+  <w:num w:numId="6">
     <w:abstractNumId w:val="6"/>
-    <w:lvlOverride w:ilvl="0">
-      <w:startOverride w:val="1"/>
-    </w:lvlOverride>
-  </w:num>
-  <w:num w:numId="6">
-    <w:abstractNumId w:val="2"/>
     <w:lvlOverride w:ilvl="0">
       <w:startOverride w:val="1"/>
     </w:lvlOverride>
   </w:num>
   <w:num w:numId="7">
     <w:abstractNumId w:val="7"/>
+    <w:lvlOverride w:ilvl="0">
+      <w:startOverride w:val="1"/>
+    </w:lvlOverride>
+  </w:num>
+  <w:num w:numId="8">
+    <w:abstractNumId w:val="8"/>
+    <w:lvlOverride w:ilvl="0">
+      <w:startOverride w:val="1"/>
+    </w:lvlOverride>
+  </w:num>
+  <w:num w:numId="9">
+    <w:abstractNumId w:val="9"/>
     <w:lvlOverride w:ilvl="0">
       <w:startOverride w:val="1"/>
     </w:lvlOverride>

</xml_diff>